<commit_message>
Dossier et journal : relecture et réécriture du texte
Texte reformulé en phrases complètes, sans abréviations ni symboles, mise en
forme allégée. Les faits et les mesures sont inchangés ; la section 3.5 et
la section 6.5 mentionnent l'installation de Grafana depuis son paquet et la
validation finale du 25/10. Word et PDF régénérés (dossier 15 pages,
journal 2 pages).
</commit_message>
<xml_diff>
--- a/docs/journal_de_bord.docx
+++ b/docs/journal_de_bord.docx
@@ -7,7 +7,7 @@
         <w:pStyle w:val="Titre"/>
       </w:pPr>
       <w:r>
-        <w:t xml:space="preserve">Journal de bord : RÉSULTATS-BF</w:t>
+        <w:t xml:space="preserve">Journal de bord du projet RÉSULTATS-BF</w:t>
       </w:r>
     </w:p>
     <w:p>
@@ -23,7 +23,7 @@
         <w:pStyle w:val="Date"/>
       </w:pPr>
       <w:r>
-        <w:t xml:space="preserve">M1 Informatique, IBAM · Virtualisation et Cloud Computing · Dr SOMDA · 26 octobre 2026</w:t>
+        <w:t xml:space="preserve">M1 Informatique, IBAM. Virtualisation et Cloud Computing, Dr SOMDA. 26 octobre 2026</w:t>
       </w:r>
     </w:p>
     <w:p>
@@ -31,73 +31,70 @@
         <w:pStyle w:val="FirstParagraph"/>
       </w:pPr>
       <w:r>
-        <w:t xml:space="preserve">Le détail de chaque point est dans le dossier d’architecture (§ indiqué).</w:t>
-      </w:r>
-    </w:p>
-    <w:p>
-      <w:pPr>
-        <w:pStyle w:val="Corpsdetexte"/>
-      </w:pPr>
-      <w:r>
-        <w:rPr>
-          <w:b/>
-          <w:bCs/>
-        </w:rPr>
-        <w:t xml:space="preserve">Rôles.</w:t>
+        <w:t xml:space="preserve">Ce journal résume la répartition du travail, nos principales décisions et les difficultés rencontrées.</w:t>
       </w:r>
       <w:r>
         <w:t xml:space="preserve"> </w:t>
       </w:r>
       <w:r>
-        <w:t xml:space="preserve">PORGO Abdoul Nassirou : architecte réseau et répartition (E1). KOBENDE Pêgdwendé Evrard :</w:t>
+        <w:t xml:space="preserve">Les détails se trouvent dans le dossier d’architecture, aux sections indiquées.</w:t>
+      </w:r>
+    </w:p>
+    <w:bookmarkStart w:id="9" w:name="répartition-des-rôles"/>
+    <w:p>
+      <w:pPr>
+        <w:pStyle w:val="Titre2"/>
+      </w:pPr>
+      <w:r>
+        <w:t xml:space="preserve">Répartition des rôles</w:t>
+      </w:r>
+    </w:p>
+    <w:p>
+      <w:pPr>
+        <w:pStyle w:val="FirstParagraph"/>
+      </w:pPr>
+      <w:r>
+        <w:t xml:space="preserve">PORGO Abdoul Nassirou s’est chargé du réseau et de la répartition de charge, avec l’extension E1.</w:t>
       </w:r>
       <w:r>
         <w:t xml:space="preserve"> </w:t>
       </w:r>
       <w:r>
-        <w:t xml:space="preserve">ingénieur applicatif. OUEDRAOGO Armand Hendrix : ingénieur données. THIOMBIANO Yempabou Romaric Johan :</w:t>
+        <w:t xml:space="preserve">KOBENDE Pêgdwendé Evrard a développé l’application. OUEDRAOGO Armand Hendrix s’est occupé de la base de</w:t>
       </w:r>
       <w:r>
         <w:t xml:space="preserve"> </w:t>
       </w:r>
       <w:r>
-        <w:t xml:space="preserve">ingénieur essais et observabilité (E2). Commits hors de son domaine (rotation) : V2 par KOBENDE, V6 et</w:t>
+        <w:t xml:space="preserve">données, et THIOMBIANO Yempabou Romaric Johan des essais et de la supervision, avec l’extension E2. Comme</w:t>
       </w:r>
       <w:r>
         <w:t xml:space="preserve"> </w:t>
       </w:r>
       <w:r>
-        <w:t xml:space="preserve">remise en service de la base par PORGO, node_exporter dans</w:t>
+        <w:t xml:space="preserve">le demande l’énoncé, chacun a aussi travaillé en dehors de son domaine : KOBENDE a écrit le scénario V2,</w:t>
       </w:r>
       <w:r>
         <w:t xml:space="preserve"> </w:t>
       </w:r>
       <w:r>
-        <w:rPr>
-          <w:rStyle w:val="VerbatimChar"/>
-        </w:rPr>
-        <w:t xml:space="preserve">commun.sh</w:t>
+        <w:t xml:space="preserve">PORGO le scénario V6 et la remise en service de la base, THIOMBIANO l’installation de node_exporter dans le</w:t>
       </w:r>
       <w:r>
         <w:t xml:space="preserve"> </w:t>
       </w:r>
       <w:r>
-        <w:t xml:space="preserve">par THIOMBIANO, vérification R5</w:t>
-      </w:r>
-      <w:r>
-        <w:t xml:space="preserve"> </w:t>
-      </w:r>
-      <w:r>
-        <w:t xml:space="preserve">par OUEDRAOGO.</w:t>
+        <w:t xml:space="preserve">socle commun, et OUEDRAOGO le script de vérification de la réplication (R5).</w:t>
       </w:r>
     </w:p>
-    <w:bookmarkStart w:id="9" w:name="décisions-prises-et-pourquoi"/>
+    <w:bookmarkEnd w:id="9"/>
+    <w:bookmarkStart w:id="10" w:name="décisions-prises-et-raisons"/>
     <w:p>
       <w:pPr>
         <w:pStyle w:val="Titre2"/>
       </w:pPr>
       <w:r>
-        <w:t xml:space="preserve">Décisions prises et pourquoi</w:t>
+        <w:t xml:space="preserve">Décisions prises et raisons</w:t>
       </w:r>
     </w:p>
     <w:tbl>
@@ -145,7 +142,7 @@
               <w:pStyle w:val="Compact"/>
             </w:pPr>
             <w:r>
-              <w:t xml:space="preserve">Pourquoi</w:t>
+              <w:t xml:space="preserve">Raison</w:t>
             </w:r>
           </w:p>
         </w:tc>
@@ -169,18 +166,18 @@
               <w:pStyle w:val="Compact"/>
             </w:pPr>
             <w:r>
-              <w:t xml:space="preserve">Extensions E1 et E2</w:t>
-            </w:r>
-          </w:p>
-        </w:tc>
-        <w:tc>
-          <w:tcPr/>
-          <w:p>
-            <w:pPr>
-              <w:pStyle w:val="Compact"/>
-            </w:pPr>
-            <w:r>
-              <w:t xml:space="preserve">Les plus démontrables, indépendantes du code applicatif</w:t>
+              <w:t xml:space="preserve">Réaliser les extensions E1 et E2</w:t>
+            </w:r>
+          </w:p>
+        </w:tc>
+        <w:tc>
+          <w:tcPr/>
+          <w:p>
+            <w:pPr>
+              <w:pStyle w:val="Compact"/>
+            </w:pPr>
+            <w:r>
+              <w:t xml:space="preserve">Ce sont les plus faciles à démontrer, et elles ne dépendent pas du code de l’application</w:t>
             </w:r>
           </w:p>
         </w:tc>
@@ -204,18 +201,18 @@
               <w:pStyle w:val="Compact"/>
             </w:pPr>
             <w:r>
-              <w:t xml:space="preserve">HAProxy plutôt que Nginx</w:t>
-            </w:r>
-          </w:p>
-        </w:tc>
-        <w:tc>
-          <w:tcPr/>
-          <w:p>
-            <w:pPr>
-              <w:pStyle w:val="Compact"/>
-            </w:pPr>
-            <w:r>
-              <w:t xml:space="preserve">Sonde active sur</w:t>
+              <w:t xml:space="preserve">Utiliser HAProxy plutôt que Nginx</w:t>
+            </w:r>
+          </w:p>
+        </w:tc>
+        <w:tc>
+          <w:tcPr/>
+          <w:p>
+            <w:pPr>
+              <w:pStyle w:val="Compact"/>
+            </w:pPr>
+            <w:r>
+              <w:t xml:space="preserve">HAProxy sait interroger</w:t>
             </w:r>
             <w:r>
               <w:t xml:space="preserve"> </w:t>
@@ -230,19 +227,7 @@
               <w:t xml:space="preserve"> </w:t>
             </w:r>
             <w:r>
-              <w:t xml:space="preserve">(Nginx libre : contrôles passifs), rejeu</w:t>
-            </w:r>
-            <w:r>
-              <w:t xml:space="preserve"> </w:t>
-            </w:r>
-            <w:r>
-              <w:rPr>
-                <w:rStyle w:val="VerbatimChar"/>
-              </w:rPr>
-              <w:t xml:space="preserve">retry-on</w:t>
-            </w:r>
-            <w:r>
-              <w:t xml:space="preserve">, métriques intégrées</w:t>
+              <w:t xml:space="preserve">de lui-même, alors que la version libre de Nginx ne fait que des contrôles passifs. Il sait aussi rejouer une requête et fournit des métriques</w:t>
             </w:r>
           </w:p>
         </w:tc>
@@ -266,7 +251,7 @@
               <w:pStyle w:val="Compact"/>
             </w:pPr>
             <w:r>
-              <w:t xml:space="preserve">HAProxy et keepalived engendrés depuis</w:t>
+              <w:t xml:space="preserve">Générer la configuration de HAProxy et de keepalived à partir de</w:t>
             </w:r>
             <w:r>
               <w:t xml:space="preserve"> </w:t>
@@ -286,7 +271,7 @@
               <w:pStyle w:val="Compact"/>
             </w:pPr>
             <w:r>
-              <w:t xml:space="preserve">R3 : aucune adresse en dur, même source que le Vagrantfile</w:t>
+              <w:t xml:space="preserve">Aucune adresse écrite en dur, et la même source que le Vagrantfile (R3)</w:t>
             </w:r>
           </w:p>
         </w:tc>
@@ -309,6 +294,12 @@
             <w:pPr>
               <w:pStyle w:val="Compact"/>
             </w:pPr>
+            <w:r>
+              <w:t xml:space="preserve">Créer le fichier</w:t>
+            </w:r>
+            <w:r>
+              <w:t xml:space="preserve"> </w:t>
+            </w:r>
             <w:r>
               <w:rPr>
                 <w:rStyle w:val="VerbatimChar"/>
@@ -319,7 +310,7 @@
               <w:t xml:space="preserve"> </w:t>
             </w:r>
             <w:r>
-              <w:t xml:space="preserve">créé au premier</w:t>
+              <w:t xml:space="preserve">au premier</w:t>
             </w:r>
             <w:r>
               <w:t xml:space="preserve"> </w:t>
@@ -331,18 +322,18 @@
               <w:t xml:space="preserve">vagrant up</w:t>
             </w:r>
             <w:r>
-              <w:t xml:space="preserve">, mots de passe aléatoires</w:t>
-            </w:r>
-          </w:p>
-        </w:tc>
-        <w:tc>
-          <w:tcPr/>
-          <w:p>
-            <w:pPr>
-              <w:pStyle w:val="Compact"/>
-            </w:pPr>
-            <w:r>
-              <w:t xml:space="preserve">Concilier R1 (aucun geste manuel) et R7 (aucun secret versionné)</w:t>
+              <w:t xml:space="preserve">, avec des mots de passe aléatoires</w:t>
+            </w:r>
+          </w:p>
+        </w:tc>
+        <w:tc>
+          <w:tcPr/>
+          <w:p>
+            <w:pPr>
+              <w:pStyle w:val="Compact"/>
+            </w:pPr>
+            <w:r>
+              <w:t xml:space="preserve">Respecter à la fois R1 (aucune intervention manuelle) et R7 (aucun secret dans le dépôt)</w:t>
             </w:r>
           </w:p>
         </w:tc>
@@ -366,18 +357,18 @@
               <w:pStyle w:val="Compact"/>
             </w:pPr>
             <w:r>
-              <w:t xml:space="preserve">VRRP unicast, deux LB en BACKUP, priorités 150/100</w:t>
-            </w:r>
-          </w:p>
-        </w:tc>
-        <w:tc>
-          <w:tcPr/>
-          <w:p>
-            <w:pPr>
-              <w:pStyle w:val="Compact"/>
-            </w:pPr>
-            <w:r>
-              <w:t xml:space="preserve">Ne pas dépendre du multicast ; pas de double maître au démarrage</w:t>
+              <w:t xml:space="preserve">VRRP en unicast, les deux répartiteurs démarrant en attente avec des priorités de 150 et 100</w:t>
+            </w:r>
+          </w:p>
+        </w:tc>
+        <w:tc>
+          <w:tcPr/>
+          <w:p>
+            <w:pPr>
+              <w:pStyle w:val="Compact"/>
+            </w:pPr>
+            <w:r>
+              <w:t xml:space="preserve">Ne pas dépendre du multicast et éviter d’avoir deux maîtres au démarrage</w:t>
             </w:r>
           </w:p>
         </w:tc>
@@ -401,18 +392,18 @@
               <w:pStyle w:val="Compact"/>
             </w:pPr>
             <w:r>
-              <w:t xml:space="preserve">Une connexion à la base par requête, sans pool</w:t>
-            </w:r>
-          </w:p>
-        </w:tc>
-        <w:tc>
-          <w:tcPr/>
-          <w:p>
-            <w:pPr>
-              <w:pStyle w:val="Compact"/>
-            </w:pPr>
-            <w:r>
-              <w:t xml:space="preserve">Application strictement sans état, reconnexion naturelle après bascule</w:t>
+              <w:t xml:space="preserve">Ouvrir une connexion à la base par requête, sans réserve de connexions</w:t>
+            </w:r>
+          </w:p>
+        </w:tc>
+        <w:tc>
+          <w:tcPr/>
+          <w:p>
+            <w:pPr>
+              <w:pStyle w:val="Compact"/>
+            </w:pPr>
+            <w:r>
+              <w:t xml:space="preserve">Garder une application strictement sans état, qui se reconnecte naturellement après une bascule</w:t>
             </w:r>
           </w:p>
         </w:tc>
@@ -435,46 +426,23 @@
             <w:pPr>
               <w:pStyle w:val="Compact"/>
             </w:pPr>
+            <w:r>
+              <w:t xml:space="preserve">Connexion à</w:t>
+            </w:r>
+            <w:r>
+              <w:t xml:space="preserve"> </w:t>
+            </w:r>
             <w:r>
               <w:rPr>
                 <w:rStyle w:val="VerbatimChar"/>
               </w:rPr>
-              <w:t xml:space="preserve">host=bdd1,bdd2 target_session_attrs=read-write</w:t>
-            </w:r>
-          </w:p>
-        </w:tc>
-        <w:tc>
-          <w:tcPr/>
-          <w:p>
-            <w:pPr>
-              <w:pStyle w:val="Compact"/>
-            </w:pPr>
-            <w:r>
-              <w:t xml:space="preserve">L’application suit la bascule sans modification ni redémarrage</w:t>
-            </w:r>
-          </w:p>
-        </w:tc>
-      </w:tr>
-      <w:tr>
-        <w:tc>
-          <w:tcPr/>
-          <w:p>
-            <w:pPr>
-              <w:pStyle w:val="Compact"/>
-            </w:pPr>
-            <w:r>
-              <w:t xml:space="preserve">KOBENDE</w:t>
-            </w:r>
-          </w:p>
-        </w:tc>
-        <w:tc>
-          <w:tcPr/>
-          <w:p>
-            <w:pPr>
-              <w:pStyle w:val="Compact"/>
-            </w:pPr>
-            <w:r>
-              <w:t xml:space="preserve">Service systemd non root,</w:t>
+              <w:t xml:space="preserve">bdd1,bdd2</w:t>
+            </w:r>
+            <w:r>
+              <w:t xml:space="preserve"> </w:t>
+            </w:r>
+            <w:r>
+              <w:t xml:space="preserve">avec</w:t>
             </w:r>
             <w:r>
               <w:t xml:space="preserve"> </w:t>
@@ -483,13 +451,42 @@
               <w:rPr>
                 <w:rStyle w:val="VerbatimChar"/>
               </w:rPr>
-              <w:t xml:space="preserve">app.env</w:t>
-            </w:r>
-            <w:r>
-              <w:t xml:space="preserve"> </w:t>
-            </w:r>
-            <w:r>
-              <w:t xml:space="preserve">en 600 ;</w:t>
+              <w:t xml:space="preserve">target_session_attrs=read-write</w:t>
+            </w:r>
+          </w:p>
+        </w:tc>
+        <w:tc>
+          <w:tcPr/>
+          <w:p>
+            <w:pPr>
+              <w:pStyle w:val="Compact"/>
+            </w:pPr>
+            <w:r>
+              <w:t xml:space="preserve">L’application suit la bascule sans être modifiée ni redémarrée</w:t>
+            </w:r>
+          </w:p>
+        </w:tc>
+      </w:tr>
+      <w:tr>
+        <w:tc>
+          <w:tcPr/>
+          <w:p>
+            <w:pPr>
+              <w:pStyle w:val="Compact"/>
+            </w:pPr>
+            <w:r>
+              <w:t xml:space="preserve">KOBENDE</w:t>
+            </w:r>
+          </w:p>
+        </w:tc>
+        <w:tc>
+          <w:tcPr/>
+          <w:p>
+            <w:pPr>
+              <w:pStyle w:val="Compact"/>
+            </w:pPr>
+            <w:r>
+              <w:t xml:space="preserve">Service systemd sans droits root, configuration en mode 600,</w:t>
             </w:r>
             <w:r>
               <w:t xml:space="preserve"> </w:t>
@@ -509,7 +506,7 @@
               <w:pStyle w:val="Compact"/>
             </w:pPr>
             <w:r>
-              <w:t xml:space="preserve">Moindre privilège ;</w:t>
+              <w:t xml:space="preserve">Limiter les privilèges et garantir que</w:t>
             </w:r>
             <w:r>
               <w:t xml:space="preserve"> </w:t>
@@ -524,7 +521,7 @@
               <w:t xml:space="preserve"> </w:t>
             </w:r>
             <w:r>
-              <w:t xml:space="preserve">répond toujours avant le délai de la sonde</w:t>
+              <w:t xml:space="preserve">répond avant la fin du délai de la sonde</w:t>
             </w:r>
           </w:p>
         </w:tc>
@@ -548,7 +545,7 @@
               <w:pStyle w:val="Compact"/>
             </w:pPr>
             <w:r>
-              <w:t xml:space="preserve">Cibles Prometheus engendrées, rôle obs rejoué à chaque</w:t>
+              <w:t xml:space="preserve">Générer les cibles de Prometheus et rejouer le rôle obs à chaque</w:t>
             </w:r>
             <w:r>
               <w:t xml:space="preserve"> </w:t>
@@ -568,7 +565,7 @@
               <w:pStyle w:val="Compact"/>
             </w:pPr>
             <w:r>
-              <w:t xml:space="preserve">R3 : app3 et app4 apparaissent seules (mesuré : 7 → 9 → 7 machines)</w:t>
+              <w:t xml:space="preserve">app3 et app4 apparaissent seules quand on les ajoute (7, puis 9, puis 7 machines mesurées)</w:t>
             </w:r>
           </w:p>
         </w:tc>
@@ -592,18 +589,18 @@
               <w:pStyle w:val="Compact"/>
             </w:pPr>
             <w:r>
-              <w:t xml:space="preserve">Tableau de bord Grafana provisionné par fichiers</w:t>
-            </w:r>
-          </w:p>
-        </w:tc>
-        <w:tc>
-          <w:tcPr/>
-          <w:p>
-            <w:pPr>
-              <w:pStyle w:val="Compact"/>
-            </w:pPr>
-            <w:r>
-              <w:t xml:space="preserve">R1 : il survit à</w:t>
+              <w:t xml:space="preserve">Décrire le tableau de bord Grafana par des fichiers</w:t>
+            </w:r>
+          </w:p>
+        </w:tc>
+        <w:tc>
+          <w:tcPr/>
+          <w:p>
+            <w:pPr>
+              <w:pStyle w:val="Compact"/>
+            </w:pPr>
+            <w:r>
+              <w:t xml:space="preserve">Il est recréé à l’identique après un</w:t>
             </w:r>
             <w:r>
               <w:t xml:space="preserve"> </w:t>
@@ -614,6 +611,12 @@
               </w:rPr>
               <w:t xml:space="preserve">vagrant destroy</w:t>
             </w:r>
+            <w:r>
+              <w:t xml:space="preserve"> </w:t>
+            </w:r>
+            <w:r>
+              <w:t xml:space="preserve">(R1)</w:t>
+            </w:r>
           </w:p>
         </w:tc>
       </w:tr>
@@ -636,49 +639,18 @@
               <w:pStyle w:val="Compact"/>
             </w:pPr>
             <w:r>
-              <w:t xml:space="preserve">V3 : 3 tirs par N, médiane,</w:t>
-            </w:r>
-            <w:r>
-              <w:t xml:space="preserve"> </w:t>
-            </w:r>
-            <w:r>
-              <w:rPr>
-                <w:b/>
-                <w:bCs/>
-              </w:rPr>
-              <w:t xml:space="preserve">débit utile</w:t>
-            </w:r>
-            <w:r>
-              <w:t xml:space="preserve"> </w:t>
-            </w:r>
-            <w:r>
-              <w:t xml:space="preserve">(réponses 200/s)</w:t>
-            </w:r>
-          </w:p>
-        </w:tc>
-        <w:tc>
-          <w:tcPr/>
-          <w:p>
-            <w:pPr>
-              <w:pStyle w:val="Compact"/>
-            </w:pPr>
-            <w:r>
-              <w:t xml:space="preserve">Un tir est trop bruité ;</w:t>
-            </w:r>
-            <w:r>
-              <w:t xml:space="preserve"> </w:t>
-            </w:r>
-            <w:r>
-              <w:rPr>
-                <w:rStyle w:val="VerbatimChar"/>
-              </w:rPr>
-              <w:t xml:space="preserve">ab</w:t>
-            </w:r>
-            <w:r>
-              <w:t xml:space="preserve"> </w:t>
-            </w:r>
-            <w:r>
-              <w:t xml:space="preserve">compte les 503 dans ses req/s</w:t>
+              <w:t xml:space="preserve">Pour V3, trois tirs par configuration, valeur médiane et calcul du débit utile</w:t>
+            </w:r>
+          </w:p>
+        </w:tc>
+        <w:tc>
+          <w:tcPr/>
+          <w:p>
+            <w:pPr>
+              <w:pStyle w:val="Compact"/>
+            </w:pPr>
+            <w:r>
+              <w:t xml:space="preserve">Un seul tir est trop variable, et ab compte les réponses 503 dans son nombre de requêtes par seconde</w:t>
             </w:r>
           </w:p>
         </w:tc>
@@ -691,36 +663,36 @@
               <w:pStyle w:val="Compact"/>
             </w:pPr>
             <w:r>
-              <w:t xml:space="preserve">THIOMBIANO</w:t>
-            </w:r>
-          </w:p>
-        </w:tc>
-        <w:tc>
-          <w:tcPr/>
-          <w:p>
-            <w:pPr>
-              <w:pStyle w:val="Compact"/>
-            </w:pPr>
-            <w:r>
-              <w:t xml:space="preserve">Ne pas ajouter de pool de connexions à deux jours du rendu</w:t>
-            </w:r>
-          </w:p>
-        </w:tc>
-        <w:tc>
-          <w:tcPr/>
-          <w:p>
-            <w:pPr>
-              <w:pStyle w:val="Compact"/>
-            </w:pPr>
-            <w:r>
-              <w:t xml:space="preserve">Décision de KOBENDE et PORGO ; aurait imposé de refaire V2, V4, R4, V6</w:t>
+              <w:t xml:space="preserve">Groupe</w:t>
+            </w:r>
+          </w:p>
+        </w:tc>
+        <w:tc>
+          <w:tcPr/>
+          <w:p>
+            <w:pPr>
+              <w:pStyle w:val="Compact"/>
+            </w:pPr>
+            <w:r>
+              <w:t xml:space="preserve">Ne pas ajouter de réserve de connexions à deux jours du rendu</w:t>
+            </w:r>
+          </w:p>
+        </w:tc>
+        <w:tc>
+          <w:tcPr/>
+          <w:p>
+            <w:pPr>
+              <w:pStyle w:val="Compact"/>
+            </w:pPr>
+            <w:r>
+              <w:t xml:space="preserve">Il aurait fallu refaire les mesures V2, V4, R4 et V6</w:t>
             </w:r>
           </w:p>
         </w:tc>
       </w:tr>
     </w:tbl>
-    <w:bookmarkEnd w:id="9"/>
-    <w:bookmarkStart w:id="10" w:name="difficultés-rencontrées-et-solutions"/>
+    <w:bookmarkEnd w:id="10"/>
+    <w:bookmarkStart w:id="11" w:name="difficultés-rencontrées-et-solutions"/>
     <w:p>
       <w:pPr>
         <w:pStyle w:val="Titre2"/>
@@ -798,7 +770,7 @@
               <w:pStyle w:val="Compact"/>
             </w:pPr>
             <w:r>
-              <w:t xml:space="preserve">La box</w:t>
+              <w:t xml:space="preserve">La version</w:t>
             </w:r>
             <w:r>
               <w:t xml:space="preserve"> </w:t>
@@ -813,18 +785,18 @@
               <w:t xml:space="preserve"> </w:t>
             </w:r>
             <w:r>
-              <w:t xml:space="preserve">du squelette n’existe pas pour virtualbox/amd64</w:t>
-            </w:r>
-          </w:p>
-        </w:tc>
-        <w:tc>
-          <w:tcPr/>
-          <w:p>
-            <w:pPr>
-              <w:pStyle w:val="Compact"/>
-            </w:pPr>
-            <w:r>
-              <w:t xml:space="preserve">Épinglage sur</w:t>
+              <w:t xml:space="preserve">de la box donnée dans l’énoncé n’existe pas pour VirtualBox</w:t>
+            </w:r>
+          </w:p>
+        </w:tc>
+        <w:tc>
+          <w:tcPr/>
+          <w:p>
+            <w:pPr>
+              <w:pStyle w:val="Compact"/>
+            </w:pPr>
+            <w:r>
+              <w:t xml:space="preserve">Nous avons fixé la version</w:t>
             </w:r>
             <w:r>
               <w:t xml:space="preserve"> </w:t>
@@ -863,7 +835,27 @@
               <w:pStyle w:val="Compact"/>
             </w:pPr>
             <w:r>
-              <w:t xml:space="preserve">Exportateur Prometheus actif sur lb2 seulement :</w:t>
+              <w:t xml:space="preserve">L’exportateur Prometheus de HAProxy n’était activé que sur lb2 : la commande de détection échouait au hasard à cause de l’option</w:t>
+            </w:r>
+            <w:r>
+              <w:t xml:space="preserve"> </w:t>
+            </w:r>
+            <w:r>
+              <w:rPr>
+                <w:rStyle w:val="VerbatimChar"/>
+              </w:rPr>
+              <w:t xml:space="preserve">pipefail</w:t>
+            </w:r>
+          </w:p>
+        </w:tc>
+        <w:tc>
+          <w:tcPr/>
+          <w:p>
+            <w:pPr>
+              <w:pStyle w:val="Compact"/>
+            </w:pPr>
+            <w:r>
+              <w:t xml:space="preserve">La sortie de</w:t>
             </w:r>
             <w:r>
               <w:t xml:space="preserve"> </w:t>
@@ -878,48 +870,7 @@
               <w:t xml:space="preserve"> </w:t>
             </w:r>
             <w:r>
-              <w:t xml:space="preserve">filtré par</w:t>
-            </w:r>
-            <w:r>
-              <w:t xml:space="preserve"> </w:t>
-            </w:r>
-            <w:r>
-              <w:rPr>
-                <w:rStyle w:val="VerbatimChar"/>
-              </w:rPr>
-              <w:t xml:space="preserve">grep -q</w:t>
-            </w:r>
-            <w:r>
-              <w:t xml:space="preserve"> </w:t>
-            </w:r>
-            <w:r>
-              <w:t xml:space="preserve">échoue au hasard sous</w:t>
-            </w:r>
-            <w:r>
-              <w:t xml:space="preserve"> </w:t>
-            </w:r>
-            <w:r>
-              <w:rPr>
-                <w:rStyle w:val="VerbatimChar"/>
-              </w:rPr>
-              <w:t xml:space="preserve">pipefail</w:t>
-            </w:r>
-            <w:r>
-              <w:t xml:space="preserve"> </w:t>
-            </w:r>
-            <w:r>
-              <w:t xml:space="preserve">(SIGPIPE)</w:t>
-            </w:r>
-          </w:p>
-        </w:tc>
-        <w:tc>
-          <w:tcPr/>
-          <w:p>
-            <w:pPr>
-              <w:pStyle w:val="Compact"/>
-            </w:pPr>
-            <w:r>
-              <w:t xml:space="preserve">Sortie capturée dans une variable avant le test</w:t>
+              <w:t xml:space="preserve">est d’abord enregistrée dans une variable, puis testée</w:t>
             </w:r>
           </w:p>
         </w:tc>
@@ -943,7 +894,7 @@
               <w:pStyle w:val="Compact"/>
             </w:pPr>
             <w:r>
-              <w:t xml:space="preserve">V6 : première mesure prise depuis l’ordre</w:t>
+              <w:t xml:space="preserve">La première mesure de V6 partait de l’ordre</w:t>
             </w:r>
             <w:r>
               <w:t xml:space="preserve"> </w:t>
@@ -955,18 +906,18 @@
               <w:t xml:space="preserve">vagrant halt</w:t>
             </w:r>
             <w:r>
-              <w:t xml:space="preserve">, alors que lb1 sert encore pendant son arrêt</w:t>
-            </w:r>
-          </w:p>
-        </w:tc>
-        <w:tc>
-          <w:tcPr/>
-          <w:p>
-            <w:pPr>
-              <w:pStyle w:val="Compact"/>
-            </w:pPr>
-            <w:r>
-              <w:t xml:space="preserve">Mesure de l’interruption réelle : 1,7 s ; les deux fichiers bruts sont conservés</w:t>
+              <w:t xml:space="preserve">, alors que lb1 continue de servir pendant son arrêt</w:t>
+            </w:r>
+          </w:p>
+        </w:tc>
+        <w:tc>
+          <w:tcPr/>
+          <w:p>
+            <w:pPr>
+              <w:pStyle w:val="Compact"/>
+            </w:pPr>
+            <w:r>
+              <w:t xml:space="preserve">Nous mesurons maintenant l’interruption réelle, soit 1,7 s. Les deux fichiers de résultats sont conservés</w:t>
             </w:r>
           </w:p>
         </w:tc>
@@ -990,7 +941,7 @@
               <w:pStyle w:val="Compact"/>
             </w:pPr>
             <w:r>
-              <w:t xml:space="preserve">VM figée en SSH par manque de RAM sur l’hôte</w:t>
+              <w:t xml:space="preserve">Une machine virtuelle s’est figée par manque de mémoire sur l’ordinateur hôte</w:t>
             </w:r>
           </w:p>
         </w:tc>
@@ -1007,25 +958,7 @@
               <w:t xml:space="preserve">vagrant reload</w:t>
             </w:r>
             <w:r>
-              <w:t xml:space="preserve"> </w:t>
-            </w:r>
-            <w:r>
-              <w:t xml:space="preserve">;</w:t>
-            </w:r>
-            <w:r>
-              <w:t xml:space="preserve"> </w:t>
-            </w:r>
-            <w:r>
-              <w:rPr>
-                <w:rStyle w:val="VerbatimChar"/>
-              </w:rPr>
-              <w:t xml:space="preserve">E2_OBS=0</w:t>
-            </w:r>
-            <w:r>
-              <w:t xml:space="preserve"> </w:t>
-            </w:r>
-            <w:r>
-              <w:t xml:space="preserve">pendant le développement</w:t>
+              <w:t xml:space="preserve">, et désactivation de obs pendant le développement</w:t>
             </w:r>
           </w:p>
         </w:tc>
@@ -1049,7 +982,7 @@
               <w:pStyle w:val="Compact"/>
             </w:pPr>
             <w:r>
-              <w:t xml:space="preserve">Après une bascule réussie, service toujours en 503 :</w:t>
+              <w:t xml:space="preserve">Après une bascule réussie, le service restait en 503 :</w:t>
             </w:r>
             <w:r>
               <w:t xml:space="preserve"> </w:t>
@@ -1064,42 +997,18 @@
               <w:t xml:space="preserve"> </w:t>
             </w:r>
             <w:r>
-              <w:t xml:space="preserve">dépasse</w:t>
-            </w:r>
-            <w:r>
-              <w:t xml:space="preserve"> </w:t>
-            </w:r>
-            <w:r>
-              <w:rPr>
-                <w:rStyle w:val="VerbatimChar"/>
-              </w:rPr>
-              <w:t xml:space="preserve">timeout check 1s</w:t>
-            </w:r>
-            <w:r>
-              <w:t xml:space="preserve"> </w:t>
-            </w:r>
-            <w:r>
-              <w:t xml:space="preserve">(libpq essaie d’abord bdd1 éteinte)</w:t>
-            </w:r>
-          </w:p>
-        </w:tc>
-        <w:tc>
-          <w:tcPr/>
-          <w:p>
-            <w:pPr>
-              <w:pStyle w:val="Compact"/>
-            </w:pPr>
-            <w:r>
-              <w:rPr>
-                <w:rStyle w:val="VerbatimChar"/>
-              </w:rPr>
-              <w:t xml:space="preserve">timeout check 3s</w:t>
-            </w:r>
-            <w:r>
-              <w:t xml:space="preserve"> </w:t>
-            </w:r>
-            <w:r>
-              <w:t xml:space="preserve">; compromis documenté (§ 3.1)</w:t>
+              <w:t xml:space="preserve">dépassait le délai d’une seconde de la sonde, car libpq essaie d’abord bdd1, éteinte</w:t>
+            </w:r>
+          </w:p>
+        </w:tc>
+        <w:tc>
+          <w:tcPr/>
+          <w:p>
+            <w:pPr>
+              <w:pStyle w:val="Compact"/>
+            </w:pPr>
+            <w:r>
+              <w:t xml:space="preserve">Délai de lecture porté à 3 secondes (section 3.1)</w:t>
             </w:r>
           </w:p>
         </w:tc>
@@ -1123,31 +1032,22 @@
               <w:pStyle w:val="Compact"/>
             </w:pPr>
             <w:r>
-              <w:t xml:space="preserve">bdd1 rallumée après bascule redémarre en primaire (deux primaires) ;</w:t>
-            </w:r>
-            <w:r>
-              <w:t xml:space="preserve"> </w:t>
-            </w:r>
-            <w:r>
-              <w:rPr>
-                <w:rStyle w:val="VerbatimChar"/>
-              </w:rPr>
-              <w:t xml:space="preserve">provision bdd2</w:t>
-            </w:r>
-            <w:r>
-              <w:t xml:space="preserve"> </w:t>
-            </w:r>
-            <w:r>
-              <w:t xml:space="preserve">effaçait la base promue</w:t>
-            </w:r>
-          </w:p>
-        </w:tc>
-        <w:tc>
-          <w:tcPr/>
-          <w:p>
-            <w:pPr>
-              <w:pStyle w:val="Compact"/>
-            </w:pPr>
+              <w:t xml:space="preserve">Rallumée après une bascule, bdd1 redémarrait en primaire, et rejouer l’installation de bdd2 effaçait la base promue</w:t>
+            </w:r>
+          </w:p>
+        </w:tc>
+        <w:tc>
+          <w:tcPr/>
+          <w:p>
+            <w:pPr>
+              <w:pStyle w:val="Compact"/>
+            </w:pPr>
+            <w:r>
+              <w:t xml:space="preserve">Le script</w:t>
+            </w:r>
+            <w:r>
+              <w:t xml:space="preserve"> </w:t>
+            </w:r>
             <w:r>
               <w:rPr>
                 <w:rStyle w:val="VerbatimChar"/>
@@ -1158,7 +1058,7 @@
               <w:t xml:space="preserve"> </w:t>
             </w:r>
             <w:r>
-              <w:t xml:space="preserve">compare les lignes de temps et reconvertit en réplique (§ 5.3)</w:t>
+              <w:t xml:space="preserve">compare les lignes de temps de PostgreSQL et reconvertit l’ancien primaire en réplique (section 5.3)</w:t>
             </w:r>
           </w:p>
         </w:tc>
@@ -1171,6 +1071,92 @@
               <w:pStyle w:val="Compact"/>
             </w:pPr>
             <w:r>
+              <w:t xml:space="preserve">PORGO</w:t>
+            </w:r>
+          </w:p>
+        </w:tc>
+        <w:tc>
+          <w:tcPr/>
+          <w:p>
+            <w:pPr>
+              <w:pStyle w:val="Compact"/>
+            </w:pPr>
+            <w:r>
+              <w:t xml:space="preserve">Lors de la validation finale,</w:t>
+            </w:r>
+            <w:r>
+              <w:t xml:space="preserve"> </w:t>
+            </w:r>
+            <w:r>
+              <w:rPr>
+                <w:rStyle w:val="VerbatimChar"/>
+              </w:rPr>
+              <w:t xml:space="preserve">vagrant up</w:t>
+            </w:r>
+            <w:r>
+              <w:t xml:space="preserve"> </w:t>
+            </w:r>
+            <w:r>
+              <w:t xml:space="preserve">échouait sur obs : le dépôt</w:t>
+            </w:r>
+            <w:r>
+              <w:t xml:space="preserve"> </w:t>
+            </w:r>
+            <w:r>
+              <w:rPr>
+                <w:rStyle w:val="VerbatimChar"/>
+              </w:rPr>
+              <w:t xml:space="preserve">apt.grafana.com</w:t>
+            </w:r>
+            <w:r>
+              <w:t xml:space="preserve"> </w:t>
+            </w:r>
+            <w:r>
+              <w:t xml:space="preserve">était injoignable depuis notre réseau</w:t>
+            </w:r>
+          </w:p>
+        </w:tc>
+        <w:tc>
+          <w:tcPr/>
+          <w:p>
+            <w:pPr>
+              <w:pStyle w:val="Compact"/>
+            </w:pPr>
+            <w:r>
+              <w:t xml:space="preserve">Grafana 13.2.4 est installé depuis le paquet de</w:t>
+            </w:r>
+            <w:r>
+              <w:t xml:space="preserve"> </w:t>
+            </w:r>
+            <w:r>
+              <w:rPr>
+                <w:rStyle w:val="VerbatimChar"/>
+              </w:rPr>
+              <w:t xml:space="preserve">dl.grafana.com</w:t>
+            </w:r>
+            <w:r>
+              <w:t xml:space="preserve">, vérifié par son empreinte et gardé en cache dans</w:t>
+            </w:r>
+            <w:r>
+              <w:t xml:space="preserve"> </w:t>
+            </w:r>
+            <w:r>
+              <w:rPr>
+                <w:rStyle w:val="VerbatimChar"/>
+              </w:rPr>
+              <w:t xml:space="preserve">.cache/</w:t>
+            </w:r>
+          </w:p>
+        </w:tc>
+      </w:tr>
+      <w:tr>
+        <w:tc>
+          <w:tcPr/>
+          <w:p>
+            <w:pPr>
+              <w:pStyle w:val="Compact"/>
+            </w:pPr>
+            <w:r>
               <w:t xml:space="preserve">KOBENDE</w:t>
             </w:r>
           </w:p>
@@ -1182,7 +1168,7 @@
               <w:pStyle w:val="Compact"/>
             </w:pPr>
             <w:r>
-              <w:t xml:space="preserve">Mac M2 (ARM) : la box amd64 ne tourne pas</w:t>
+              <w:t xml:space="preserve">Son Mac M2 (processeur ARM) ne peut pas faire tourner la box</w:t>
             </w:r>
           </w:p>
         </w:tc>
@@ -1202,7 +1188,7 @@
               <w:t xml:space="preserve"> </w:t>
             </w:r>
             <w:r>
-              <w:t xml:space="preserve">testé sans base sur l’hôte ; tests en VM sur le poste de PORGO</w:t>
+              <w:t xml:space="preserve">a été testé sans base sur son ordinateur, puis dans les machines virtuelles sur le poste de PORGO</w:t>
             </w:r>
           </w:p>
         </w:tc>
@@ -1226,18 +1212,18 @@
               <w:pStyle w:val="Compact"/>
             </w:pPr>
             <w:r>
-              <w:t xml:space="preserve">Grafana 13 met 10 min à démarrer sur 768 Mo (une douzaine de plugins, un processus chacun) : provisionnement en échec</w:t>
-            </w:r>
-          </w:p>
-        </w:tc>
-        <w:tc>
-          <w:tcPr/>
-          <w:p>
-            <w:pPr>
-              <w:pStyle w:val="Compact"/>
-            </w:pPr>
-            <w:r>
-              <w:t xml:space="preserve">Plugins inutiles désactivés : 1 min 08 s, puis « inchangé » au rejeu (§ 3.5)</w:t>
+              <w:t xml:space="preserve">Grafana 13 mettait 10 minutes à démarrer sur 768 Mo, car il chargeait une douzaine de plugins dans des processus séparés</w:t>
+            </w:r>
+          </w:p>
+        </w:tc>
+        <w:tc>
+          <w:tcPr/>
+          <w:p>
+            <w:pPr>
+              <w:pStyle w:val="Compact"/>
+            </w:pPr>
+            <w:r>
+              <w:t xml:space="preserve">Désactivation des plugins inutiles : démarrage en 1 min 08 s (section 3.5)</w:t>
             </w:r>
           </w:p>
         </w:tc>
@@ -1261,18 +1247,18 @@
               <w:pStyle w:val="Compact"/>
             </w:pPr>
             <w:r>
-              <w:t xml:space="preserve">Grafana affichait DOWN des machines détruites volontairement (retour à N = 2)</w:t>
-            </w:r>
-          </w:p>
-        </w:tc>
-        <w:tc>
-          <w:tcPr/>
-          <w:p>
-            <w:pPr>
-              <w:pStyle w:val="Compact"/>
-            </w:pPr>
-            <w:r>
-              <w:t xml:space="preserve">États en requête instantanée, frise d’historique des pannes</w:t>
+              <w:t xml:space="preserve">Grafana affichait comme hors service les machines détruites volontairement lors du retour à deux serveurs</w:t>
+            </w:r>
+          </w:p>
+        </w:tc>
+        <w:tc>
+          <w:tcPr/>
+          <w:p>
+            <w:pPr>
+              <w:pStyle w:val="Compact"/>
+            </w:pPr>
+            <w:r>
+              <w:t xml:space="preserve">États lus en instantané et frise d’historique des pannes</w:t>
             </w:r>
           </w:p>
         </w:tc>
@@ -1285,98 +1271,6 @@
               <w:pStyle w:val="Compact"/>
             </w:pPr>
             <w:r>
-              <w:t xml:space="preserve">PORGO</w:t>
-            </w:r>
-          </w:p>
-        </w:tc>
-        <w:tc>
-          <w:tcPr/>
-          <w:p>
-            <w:pPr>
-              <w:pStyle w:val="Compact"/>
-            </w:pPr>
-            <w:r>
-              <w:t xml:space="preserve">Validation finale (7 machines) :</w:t>
-            </w:r>
-            <w:r>
-              <w:t xml:space="preserve"> </w:t>
-            </w:r>
-            <w:r>
-              <w:rPr>
-                <w:rStyle w:val="VerbatimChar"/>
-              </w:rPr>
-              <w:t xml:space="preserve">vagrant up</w:t>
-            </w:r>
-            <w:r>
-              <w:t xml:space="preserve"> </w:t>
-            </w:r>
-            <w:r>
-              <w:t xml:space="preserve">en échec sur obs, apt.grafana.com injoignable depuis le réseau du poste (connexion réinitialisée), alors que dl.grafana.com répond</w:t>
-            </w:r>
-          </w:p>
-        </w:tc>
-        <w:tc>
-          <w:tcPr/>
-          <w:p>
-            <w:pPr>
-              <w:pStyle w:val="Compact"/>
-            </w:pPr>
-            <w:r>
-              <w:t xml:space="preserve">Grafana 13.2.4 installé depuis le paquet</w:t>
-            </w:r>
-            <w:r>
-              <w:t xml:space="preserve"> </w:t>
-            </w:r>
-            <w:r>
-              <w:rPr>
-                <w:rStyle w:val="VerbatimChar"/>
-              </w:rPr>
-              <w:t xml:space="preserve">.deb</w:t>
-            </w:r>
-            <w:r>
-              <w:t xml:space="preserve"> </w:t>
-            </w:r>
-            <w:r>
-              <w:t xml:space="preserve">de dl.grafana.com, empreinte SHA-256 inscrite dans</w:t>
-            </w:r>
-            <w:r>
-              <w:t xml:space="preserve"> </w:t>
-            </w:r>
-            <w:r>
-              <w:rPr>
-                <w:rStyle w:val="VerbatimChar"/>
-              </w:rPr>
-              <w:t xml:space="preserve">obs.sh</w:t>
-            </w:r>
-            <w:r>
-              <w:t xml:space="preserve">, mis en cache dans</w:t>
-            </w:r>
-            <w:r>
-              <w:t xml:space="preserve"> </w:t>
-            </w:r>
-            <w:r>
-              <w:rPr>
-                <w:rStyle w:val="VerbatimChar"/>
-              </w:rPr>
-              <w:t xml:space="preserve">.cache/</w:t>
-            </w:r>
-            <w:r>
-              <w:t xml:space="preserve"> </w:t>
-            </w:r>
-            <w:r>
-              <w:t xml:space="preserve">: la reconstruction ne dépend plus de ce dépôt</w:t>
-            </w:r>
-          </w:p>
-        </w:tc>
-      </w:tr>
-      <w:tr>
-        <w:tc>
-          <w:tcPr/>
-          <w:p>
-            <w:pPr>
-              <w:pStyle w:val="Compact"/>
-            </w:pPr>
-            <w:r>
               <w:t xml:space="preserve">THIOMBIANO</w:t>
             </w:r>
           </w:p>
@@ -1388,36 +1282,24 @@
               <w:pStyle w:val="Compact"/>
             </w:pPr>
             <w:r>
-              <w:t xml:space="preserve">V3 : 41 % puis 53 % de 503 sous</w:t>
-            </w:r>
-            <w:r>
-              <w:t xml:space="preserve"> </w:t>
-            </w:r>
-            <w:r>
-              <w:rPr>
-                <w:rStyle w:val="VerbatimChar"/>
-              </w:rPr>
-              <w:t xml:space="preserve">ab -c 50</w:t>
-            </w:r>
-            <w:r>
-              <w:t xml:space="preserve">, débit utile en baisse quand N double</w:t>
-            </w:r>
-          </w:p>
-        </w:tc>
-        <w:tc>
-          <w:tcPr/>
-          <w:p>
-            <w:pPr>
-              <w:pStyle w:val="Compact"/>
-            </w:pPr>
-            <w:r>
-              <w:t xml:space="preserve">Diagnostic : bdd1 (1 vCPU) saturée par une connexion SCRAM par requête ; résultat expliqué (§ 6.3), PgBouncer proposé (§ 7)</w:t>
+              <w:t xml:space="preserve">Pendant V3, 41 % puis 53 % des réponses étaient des 503 sous 50 clients simultanés, et le débit utile baissait avec quatre serveurs</w:t>
+            </w:r>
+          </w:p>
+        </w:tc>
+        <w:tc>
+          <w:tcPr/>
+          <w:p>
+            <w:pPr>
+              <w:pStyle w:val="Compact"/>
+            </w:pPr>
+            <w:r>
+              <w:t xml:space="preserve">La cause est bdd1, saturée par une connexion authentifiée à chaque requête. Le résultat est expliqué en section 6.3 et PgBouncer est proposé en section 7</w:t>
             </w:r>
           </w:p>
         </w:tc>
       </w:tr>
     </w:tbl>
-    <w:bookmarkEnd w:id="10"/>
+    <w:bookmarkEnd w:id="11"/>
     <w:sectPr>
       <w:footnotePr>
         <w:numRestart w:val="eachSect"/>

</xml_diff>